<commit_message>
Smooth flowchart routing for F58, F53/F53A, F40, and F43 cross-boundary edges.
F58 margin routes drop on the source column then curve into Done at 9/3 o'clock. F53 stadium merges use a dedicated cubic hook. Cross-boundary edges use curveBasis on all guided waypoints so F40 and F43 keep smooth bends instead of composite orthogonal legs.

Co-authored-by: Cursor <cursoragent@cursor.com>
</commit_message>
<xml_diff>
--- a/flow.docx
+++ b/flow.docx
@@ -360,7 +360,7 @@
                     <pic:cNvPicPr/>
                   </pic:nvPicPr>
                   <pic:blipFill>
-                    <a:blip xmlns:r="http://schemas.openxmlformats.org/officeDocument/2006/relationships" r:embed="Rc9bd3b992ed0416f"/>
+                    <a:blip xmlns:r="http://schemas.openxmlformats.org/officeDocument/2006/relationships" r:embed="R686a4073ea3e4fe0"/>
                     <a:stretch>
                       <a:fillRect/>
                     </a:stretch>
@@ -420,7 +420,7 @@
                     <pic:cNvPicPr/>
                   </pic:nvPicPr>
                   <pic:blipFill>
-                    <a:blip xmlns:r="http://schemas.openxmlformats.org/officeDocument/2006/relationships" r:embed="Red092f1500ab4870"/>
+                    <a:blip xmlns:r="http://schemas.openxmlformats.org/officeDocument/2006/relationships" r:embed="R40db68386d7244d9"/>
                     <a:stretch>
                       <a:fillRect/>
                     </a:stretch>
@@ -471,7 +471,7 @@
                     <pic:cNvPicPr/>
                   </pic:nvPicPr>
                   <pic:blipFill>
-                    <a:blip xmlns:r="http://schemas.openxmlformats.org/officeDocument/2006/relationships" r:embed="R36c36481613c418a"/>
+                    <a:blip xmlns:r="http://schemas.openxmlformats.org/officeDocument/2006/relationships" r:embed="R433cedc218624d4e"/>
                     <a:stretch>
                       <a:fillRect/>
                     </a:stretch>
@@ -522,7 +522,7 @@
                     <pic:cNvPicPr/>
                   </pic:nvPicPr>
                   <pic:blipFill>
-                    <a:blip xmlns:r="http://schemas.openxmlformats.org/officeDocument/2006/relationships" r:embed="R7be0790388db44c0"/>
+                    <a:blip xmlns:r="http://schemas.openxmlformats.org/officeDocument/2006/relationships" r:embed="R93ec992447964019"/>
                     <a:stretch>
                       <a:fillRect/>
                     </a:stretch>
@@ -573,7 +573,7 @@
                     <pic:cNvPicPr/>
                   </pic:nvPicPr>
                   <pic:blipFill>
-                    <a:blip xmlns:r="http://schemas.openxmlformats.org/officeDocument/2006/relationships" r:embed="R975f44ce909f4d3c"/>
+                    <a:blip xmlns:r="http://schemas.openxmlformats.org/officeDocument/2006/relationships" r:embed="R62e33c1f8d1245a9"/>
                     <a:stretch>
                       <a:fillRect/>
                     </a:stretch>
@@ -624,7 +624,7 @@
                     <pic:cNvPicPr/>
                   </pic:nvPicPr>
                   <pic:blipFill>
-                    <a:blip xmlns:r="http://schemas.openxmlformats.org/officeDocument/2006/relationships" r:embed="R1ccb9a54c72f4bab"/>
+                    <a:blip xmlns:r="http://schemas.openxmlformats.org/officeDocument/2006/relationships" r:embed="R3c264201aebf45cd"/>
                     <a:stretch>
                       <a:fillRect/>
                     </a:stretch>
@@ -675,7 +675,7 @@
                     <pic:cNvPicPr/>
                   </pic:nvPicPr>
                   <pic:blipFill>
-                    <a:blip xmlns:r="http://schemas.openxmlformats.org/officeDocument/2006/relationships" r:embed="R63a2d8fbd9fc4747"/>
+                    <a:blip xmlns:r="http://schemas.openxmlformats.org/officeDocument/2006/relationships" r:embed="R4aa680f02f76458e"/>
                     <a:stretch>
                       <a:fillRect/>
                     </a:stretch>
@@ -726,7 +726,7 @@
                     <pic:cNvPicPr/>
                   </pic:nvPicPr>
                   <pic:blipFill>
-                    <a:blip xmlns:r="http://schemas.openxmlformats.org/officeDocument/2006/relationships" r:embed="Ra46a9f49979e4cd0"/>
+                    <a:blip xmlns:r="http://schemas.openxmlformats.org/officeDocument/2006/relationships" r:embed="Rd30628093a56473d"/>
                     <a:stretch>
                       <a:fillRect/>
                     </a:stretch>
@@ -777,7 +777,7 @@
                     <pic:cNvPicPr/>
                   </pic:nvPicPr>
                   <pic:blipFill>
-                    <a:blip xmlns:r="http://schemas.openxmlformats.org/officeDocument/2006/relationships" r:embed="R50a764f9510c48c2"/>
+                    <a:blip xmlns:r="http://schemas.openxmlformats.org/officeDocument/2006/relationships" r:embed="R2e2ed01121bf4bd3"/>
                     <a:stretch>
                       <a:fillRect/>
                     </a:stretch>
@@ -828,7 +828,7 @@
                     <pic:cNvPicPr/>
                   </pic:nvPicPr>
                   <pic:blipFill>
-                    <a:blip xmlns:r="http://schemas.openxmlformats.org/officeDocument/2006/relationships" r:embed="Rfe833600f48d475b"/>
+                    <a:blip xmlns:r="http://schemas.openxmlformats.org/officeDocument/2006/relationships" r:embed="Rf5e2accf63554cc4"/>
                     <a:stretch>
                       <a:fillRect/>
                     </a:stretch>
@@ -898,7 +898,7 @@
                     <pic:cNvPicPr/>
                   </pic:nvPicPr>
                   <pic:blipFill>
-                    <a:blip xmlns:r="http://schemas.openxmlformats.org/officeDocument/2006/relationships" r:embed="R9847436782ab449d"/>
+                    <a:blip xmlns:r="http://schemas.openxmlformats.org/officeDocument/2006/relationships" r:embed="R6b3bfd95e3224de4"/>
                     <a:stretch>
                       <a:fillRect/>
                     </a:stretch>
@@ -949,7 +949,7 @@
                     <pic:cNvPicPr/>
                   </pic:nvPicPr>
                   <pic:blipFill>
-                    <a:blip xmlns:r="http://schemas.openxmlformats.org/officeDocument/2006/relationships" r:embed="R9bb89a015d9047aa"/>
+                    <a:blip xmlns:r="http://schemas.openxmlformats.org/officeDocument/2006/relationships" r:embed="R7d68be50ce2f45c8"/>
                     <a:stretch>
                       <a:fillRect/>
                     </a:stretch>
@@ -1000,7 +1000,7 @@
                     <pic:cNvPicPr/>
                   </pic:nvPicPr>
                   <pic:blipFill>
-                    <a:blip xmlns:r="http://schemas.openxmlformats.org/officeDocument/2006/relationships" r:embed="R88a619fb604e4304"/>
+                    <a:blip xmlns:r="http://schemas.openxmlformats.org/officeDocument/2006/relationships" r:embed="R05fa5eba7178476a"/>
                     <a:stretch>
                       <a:fillRect/>
                     </a:stretch>
@@ -1051,7 +1051,7 @@
                     <pic:cNvPicPr/>
                   </pic:nvPicPr>
                   <pic:blipFill>
-                    <a:blip xmlns:r="http://schemas.openxmlformats.org/officeDocument/2006/relationships" r:embed="R81f49d8c03b14f35"/>
+                    <a:blip xmlns:r="http://schemas.openxmlformats.org/officeDocument/2006/relationships" r:embed="Rceee11fee1514dce"/>
                     <a:stretch>
                       <a:fillRect/>
                     </a:stretch>
@@ -1102,7 +1102,7 @@
                     <pic:cNvPicPr/>
                   </pic:nvPicPr>
                   <pic:blipFill>
-                    <a:blip xmlns:r="http://schemas.openxmlformats.org/officeDocument/2006/relationships" r:embed="Rd319f257cf0c49bd"/>
+                    <a:blip xmlns:r="http://schemas.openxmlformats.org/officeDocument/2006/relationships" r:embed="R90146a899df849e5"/>
                     <a:stretch>
                       <a:fillRect/>
                     </a:stretch>
@@ -1153,7 +1153,7 @@
                     <pic:cNvPicPr/>
                   </pic:nvPicPr>
                   <pic:blipFill>
-                    <a:blip xmlns:r="http://schemas.openxmlformats.org/officeDocument/2006/relationships" r:embed="R02d9d7a0447b401a"/>
+                    <a:blip xmlns:r="http://schemas.openxmlformats.org/officeDocument/2006/relationships" r:embed="R2818728a165c4ee7"/>
                     <a:stretch>
                       <a:fillRect/>
                     </a:stretch>
@@ -1204,7 +1204,7 @@
                     <pic:cNvPicPr/>
                   </pic:nvPicPr>
                   <pic:blipFill>
-                    <a:blip xmlns:r="http://schemas.openxmlformats.org/officeDocument/2006/relationships" r:embed="R43c17cefe0244f05"/>
+                    <a:blip xmlns:r="http://schemas.openxmlformats.org/officeDocument/2006/relationships" r:embed="Rca2f2c944d2a4142"/>
                     <a:stretch>
                       <a:fillRect/>
                     </a:stretch>
@@ -1274,7 +1274,7 @@
                     <pic:cNvPicPr/>
                   </pic:nvPicPr>
                   <pic:blipFill>
-                    <a:blip xmlns:r="http://schemas.openxmlformats.org/officeDocument/2006/relationships" r:embed="R98353dc6ca06441c"/>
+                    <a:blip xmlns:r="http://schemas.openxmlformats.org/officeDocument/2006/relationships" r:embed="R67719070390f4862"/>
                     <a:stretch>
                       <a:fillRect/>
                     </a:stretch>
@@ -1325,7 +1325,7 @@
                     <pic:cNvPicPr/>
                   </pic:nvPicPr>
                   <pic:blipFill>
-                    <a:blip xmlns:r="http://schemas.openxmlformats.org/officeDocument/2006/relationships" r:embed="Reb0e2561f63f4257"/>
+                    <a:blip xmlns:r="http://schemas.openxmlformats.org/officeDocument/2006/relationships" r:embed="Ref1f8622365c4e8b"/>
                     <a:stretch>
                       <a:fillRect/>
                     </a:stretch>
@@ -1376,7 +1376,7 @@
                     <pic:cNvPicPr/>
                   </pic:nvPicPr>
                   <pic:blipFill>
-                    <a:blip xmlns:r="http://schemas.openxmlformats.org/officeDocument/2006/relationships" r:embed="Rb6f89a92238f4848"/>
+                    <a:blip xmlns:r="http://schemas.openxmlformats.org/officeDocument/2006/relationships" r:embed="Reea733c82f9f4bf5"/>
                     <a:stretch>
                       <a:fillRect/>
                     </a:stretch>
@@ -1427,7 +1427,7 @@
                     <pic:cNvPicPr/>
                   </pic:nvPicPr>
                   <pic:blipFill>
-                    <a:blip xmlns:r="http://schemas.openxmlformats.org/officeDocument/2006/relationships" r:embed="R4df121abb5c042aa"/>
+                    <a:blip xmlns:r="http://schemas.openxmlformats.org/officeDocument/2006/relationships" r:embed="R4fbc518103934e22"/>
                     <a:stretch>
                       <a:fillRect/>
                     </a:stretch>
@@ -1478,7 +1478,7 @@
                     <pic:cNvPicPr/>
                   </pic:nvPicPr>
                   <pic:blipFill>
-                    <a:blip xmlns:r="http://schemas.openxmlformats.org/officeDocument/2006/relationships" r:embed="R7c8ae2b4a4704c93"/>
+                    <a:blip xmlns:r="http://schemas.openxmlformats.org/officeDocument/2006/relationships" r:embed="R17f48108a06e4b4a"/>
                     <a:stretch>
                       <a:fillRect/>
                     </a:stretch>
@@ -1529,7 +1529,7 @@
                     <pic:cNvPicPr/>
                   </pic:nvPicPr>
                   <pic:blipFill>
-                    <a:blip xmlns:r="http://schemas.openxmlformats.org/officeDocument/2006/relationships" r:embed="Rabb400a317f54fac"/>
+                    <a:blip xmlns:r="http://schemas.openxmlformats.org/officeDocument/2006/relationships" r:embed="Rdffba276790a4f34"/>
                     <a:stretch>
                       <a:fillRect/>
                     </a:stretch>
@@ -1580,7 +1580,7 @@
                     <pic:cNvPicPr/>
                   </pic:nvPicPr>
                   <pic:blipFill>
-                    <a:blip xmlns:r="http://schemas.openxmlformats.org/officeDocument/2006/relationships" r:embed="Rf1fd8a3dae7d4917"/>
+                    <a:blip xmlns:r="http://schemas.openxmlformats.org/officeDocument/2006/relationships" r:embed="R6053723be4ba4d6f"/>
                     <a:stretch>
                       <a:fillRect/>
                     </a:stretch>
@@ -1631,7 +1631,7 @@
                     <pic:cNvPicPr/>
                   </pic:nvPicPr>
                   <pic:blipFill>
-                    <a:blip xmlns:r="http://schemas.openxmlformats.org/officeDocument/2006/relationships" r:embed="R878299a542624855"/>
+                    <a:blip xmlns:r="http://schemas.openxmlformats.org/officeDocument/2006/relationships" r:embed="Rd4de90a02f134fef"/>
                     <a:stretch>
                       <a:fillRect/>
                     </a:stretch>
@@ -1682,7 +1682,7 @@
                     <pic:cNvPicPr/>
                   </pic:nvPicPr>
                   <pic:blipFill>
-                    <a:blip xmlns:r="http://schemas.openxmlformats.org/officeDocument/2006/relationships" r:embed="Rdb469a6498834bbe"/>
+                    <a:blip xmlns:r="http://schemas.openxmlformats.org/officeDocument/2006/relationships" r:embed="Ra33295f633c44972"/>
                     <a:stretch>
                       <a:fillRect/>
                     </a:stretch>
@@ -1733,7 +1733,7 @@
                     <pic:cNvPicPr/>
                   </pic:nvPicPr>
                   <pic:blipFill>
-                    <a:blip xmlns:r="http://schemas.openxmlformats.org/officeDocument/2006/relationships" r:embed="Rfe56210cc157429e"/>
+                    <a:blip xmlns:r="http://schemas.openxmlformats.org/officeDocument/2006/relationships" r:embed="R51272d328291418b"/>
                     <a:stretch>
                       <a:fillRect/>
                     </a:stretch>
@@ -1784,7 +1784,7 @@
                     <pic:cNvPicPr/>
                   </pic:nvPicPr>
                   <pic:blipFill>
-                    <a:blip xmlns:r="http://schemas.openxmlformats.org/officeDocument/2006/relationships" r:embed="R4c6de657b3ac447c"/>
+                    <a:blip xmlns:r="http://schemas.openxmlformats.org/officeDocument/2006/relationships" r:embed="R5b5f87a9c5e94452"/>
                     <a:stretch>
                       <a:fillRect/>
                     </a:stretch>
@@ -1854,7 +1854,7 @@
                     <pic:cNvPicPr/>
                   </pic:nvPicPr>
                   <pic:blipFill>
-                    <a:blip xmlns:r="http://schemas.openxmlformats.org/officeDocument/2006/relationships" r:embed="R8d00bfefe8c84f7d"/>
+                    <a:blip xmlns:r="http://schemas.openxmlformats.org/officeDocument/2006/relationships" r:embed="Ra49b9b7a2e404653"/>
                     <a:stretch>
                       <a:fillRect/>
                     </a:stretch>
@@ -1905,7 +1905,7 @@
                     <pic:cNvPicPr/>
                   </pic:nvPicPr>
                   <pic:blipFill>
-                    <a:blip xmlns:r="http://schemas.openxmlformats.org/officeDocument/2006/relationships" r:embed="R0852fb2c6f7b4002"/>
+                    <a:blip xmlns:r="http://schemas.openxmlformats.org/officeDocument/2006/relationships" r:embed="R032d2490d472489b"/>
                     <a:stretch>
                       <a:fillRect/>
                     </a:stretch>
@@ -1956,7 +1956,7 @@
                     <pic:cNvPicPr/>
                   </pic:nvPicPr>
                   <pic:blipFill>
-                    <a:blip xmlns:r="http://schemas.openxmlformats.org/officeDocument/2006/relationships" r:embed="Rb99c9f8276c64764"/>
+                    <a:blip xmlns:r="http://schemas.openxmlformats.org/officeDocument/2006/relationships" r:embed="R84f102d3f6bb4a7a"/>
                     <a:stretch>
                       <a:fillRect/>
                     </a:stretch>
@@ -2007,7 +2007,7 @@
                     <pic:cNvPicPr/>
                   </pic:nvPicPr>
                   <pic:blipFill>
-                    <a:blip xmlns:r="http://schemas.openxmlformats.org/officeDocument/2006/relationships" r:embed="R854c5de646754fdc"/>
+                    <a:blip xmlns:r="http://schemas.openxmlformats.org/officeDocument/2006/relationships" r:embed="R2f05c1df8c8e48cd"/>
                     <a:stretch>
                       <a:fillRect/>
                     </a:stretch>
@@ -2058,7 +2058,7 @@
                     <pic:cNvPicPr/>
                   </pic:nvPicPr>
                   <pic:blipFill>
-                    <a:blip xmlns:r="http://schemas.openxmlformats.org/officeDocument/2006/relationships" r:embed="Rf5a39c48088540f8"/>
+                    <a:blip xmlns:r="http://schemas.openxmlformats.org/officeDocument/2006/relationships" r:embed="R4abcde6b04c34557"/>
                     <a:stretch>
                       <a:fillRect/>
                     </a:stretch>
@@ -2109,7 +2109,7 @@
                     <pic:cNvPicPr/>
                   </pic:nvPicPr>
                   <pic:blipFill>
-                    <a:blip xmlns:r="http://schemas.openxmlformats.org/officeDocument/2006/relationships" r:embed="R8599cb0385a14a07"/>
+                    <a:blip xmlns:r="http://schemas.openxmlformats.org/officeDocument/2006/relationships" r:embed="R41e840a33af14e05"/>
                     <a:stretch>
                       <a:fillRect/>
                     </a:stretch>
@@ -2160,7 +2160,7 @@
                     <pic:cNvPicPr/>
                   </pic:nvPicPr>
                   <pic:blipFill>
-                    <a:blip xmlns:r="http://schemas.openxmlformats.org/officeDocument/2006/relationships" r:embed="Re75535d026314d42"/>
+                    <a:blip xmlns:r="http://schemas.openxmlformats.org/officeDocument/2006/relationships" r:embed="R7713127be67545ec"/>
                     <a:stretch>
                       <a:fillRect/>
                     </a:stretch>
@@ -2230,7 +2230,7 @@
                     <pic:cNvPicPr/>
                   </pic:nvPicPr>
                   <pic:blipFill>
-                    <a:blip xmlns:r="http://schemas.openxmlformats.org/officeDocument/2006/relationships" r:embed="Red41c4feb3964972"/>
+                    <a:blip xmlns:r="http://schemas.openxmlformats.org/officeDocument/2006/relationships" r:embed="R1a563894466a4027"/>
                     <a:stretch>
                       <a:fillRect/>
                     </a:stretch>
@@ -2287,7 +2287,7 @@
                     <pic:cNvPicPr/>
                   </pic:nvPicPr>
                   <pic:blipFill>
-                    <a:blip xmlns:r="http://schemas.openxmlformats.org/officeDocument/2006/relationships" r:embed="R9ea1741c34874793"/>
+                    <a:blip xmlns:r="http://schemas.openxmlformats.org/officeDocument/2006/relationships" r:embed="R9185c5ef85964c16"/>
                     <a:stretch>
                       <a:fillRect/>
                     </a:stretch>
@@ -2347,7 +2347,7 @@
                     <pic:cNvPicPr/>
                   </pic:nvPicPr>
                   <pic:blipFill>
-                    <a:blip xmlns:r="http://schemas.openxmlformats.org/officeDocument/2006/relationships" r:embed="Rff12b429ec0b49e9"/>
+                    <a:blip xmlns:r="http://schemas.openxmlformats.org/officeDocument/2006/relationships" r:embed="R86047c37a41f4147"/>
                     <a:stretch>
                       <a:fillRect/>
                     </a:stretch>
@@ -2398,7 +2398,7 @@
                     <pic:cNvPicPr/>
                   </pic:nvPicPr>
                   <pic:blipFill>
-                    <a:blip xmlns:r="http://schemas.openxmlformats.org/officeDocument/2006/relationships" r:embed="R15b14dff7b4e4e72"/>
+                    <a:blip xmlns:r="http://schemas.openxmlformats.org/officeDocument/2006/relationships" r:embed="R02a92f6fd97d4164"/>
                     <a:stretch>
                       <a:fillRect/>
                     </a:stretch>
@@ -2449,7 +2449,7 @@
                     <pic:cNvPicPr/>
                   </pic:nvPicPr>
                   <pic:blipFill>
-                    <a:blip xmlns:r="http://schemas.openxmlformats.org/officeDocument/2006/relationships" r:embed="Re0314a63a2c74735"/>
+                    <a:blip xmlns:r="http://schemas.openxmlformats.org/officeDocument/2006/relationships" r:embed="Rd05857116c9346a7"/>
                     <a:stretch>
                       <a:fillRect/>
                     </a:stretch>
@@ -2500,7 +2500,7 @@
                     <pic:cNvPicPr/>
                   </pic:nvPicPr>
                   <pic:blipFill>
-                    <a:blip xmlns:r="http://schemas.openxmlformats.org/officeDocument/2006/relationships" r:embed="R365651d31bb24b52"/>
+                    <a:blip xmlns:r="http://schemas.openxmlformats.org/officeDocument/2006/relationships" r:embed="R57d2133c768942e4"/>
                     <a:stretch>
                       <a:fillRect/>
                     </a:stretch>
@@ -2551,7 +2551,7 @@
                     <pic:cNvPicPr/>
                   </pic:nvPicPr>
                   <pic:blipFill>
-                    <a:blip xmlns:r="http://schemas.openxmlformats.org/officeDocument/2006/relationships" r:embed="R38e6587c8ed045e7"/>
+                    <a:blip xmlns:r="http://schemas.openxmlformats.org/officeDocument/2006/relationships" r:embed="Re6ebf9b6956f4beb"/>
                     <a:stretch>
                       <a:fillRect/>
                     </a:stretch>
@@ -2629,7 +2629,7 @@
                     <pic:cNvPicPr/>
                   </pic:nvPicPr>
                   <pic:blipFill>
-                    <a:blip xmlns:r="http://schemas.openxmlformats.org/officeDocument/2006/relationships" r:embed="R25debaf35f024c4d"/>
+                    <a:blip xmlns:r="http://schemas.openxmlformats.org/officeDocument/2006/relationships" r:embed="R8b2e64d6c734451e"/>
                     <a:stretch>
                       <a:fillRect/>
                     </a:stretch>
@@ -2686,7 +2686,7 @@
                     <pic:cNvPicPr/>
                   </pic:nvPicPr>
                   <pic:blipFill>
-                    <a:blip xmlns:r="http://schemas.openxmlformats.org/officeDocument/2006/relationships" r:embed="Rf7322fc6e9e944f0"/>
+                    <a:blip xmlns:r="http://schemas.openxmlformats.org/officeDocument/2006/relationships" r:embed="R3916f23349124988"/>
                     <a:stretch>
                       <a:fillRect/>
                     </a:stretch>
@@ -2737,7 +2737,7 @@
                     <pic:cNvPicPr/>
                   </pic:nvPicPr>
                   <pic:blipFill>
-                    <a:blip xmlns:r="http://schemas.openxmlformats.org/officeDocument/2006/relationships" r:embed="Rdf5dbbd8dc4c409f"/>
+                    <a:blip xmlns:r="http://schemas.openxmlformats.org/officeDocument/2006/relationships" r:embed="R772c78e8c6a14d0b"/>
                     <a:stretch>
                       <a:fillRect/>
                     </a:stretch>
@@ -2788,7 +2788,7 @@
                     <pic:cNvPicPr/>
                   </pic:nvPicPr>
                   <pic:blipFill>
-                    <a:blip xmlns:r="http://schemas.openxmlformats.org/officeDocument/2006/relationships" r:embed="Rfe2480dedc554ee1"/>
+                    <a:blip xmlns:r="http://schemas.openxmlformats.org/officeDocument/2006/relationships" r:embed="Rb19603d5043e4496"/>
                     <a:stretch>
                       <a:fillRect/>
                     </a:stretch>
@@ -2839,7 +2839,7 @@
                     <pic:cNvPicPr/>
                   </pic:nvPicPr>
                   <pic:blipFill>
-                    <a:blip xmlns:r="http://schemas.openxmlformats.org/officeDocument/2006/relationships" r:embed="Rb91d6dd5b2ba44d2"/>
+                    <a:blip xmlns:r="http://schemas.openxmlformats.org/officeDocument/2006/relationships" r:embed="R657d10773b8f495f"/>
                     <a:stretch>
                       <a:fillRect/>
                     </a:stretch>
@@ -2921,7 +2921,7 @@
       <w:r>
         <w:t xml:space="preserve"> valid in Mermaid node labels. Use </w:t>
       </w:r>
-      <w:hyperlink xmlns:r="http://schemas.openxmlformats.org/officeDocument/2006/relationships" w:history="true" r:id="R2ea630052f7741ac">
+      <w:hyperlink xmlns:r="http://schemas.openxmlformats.org/officeDocument/2006/relationships" w:history="true" r:id="R37986ccde5b2428f">
         <w:r>
           <w:rPr>
             <w:rStyle w:val="Hyperlink"/>
@@ -2984,7 +2984,7 @@
                     <pic:cNvPicPr/>
                   </pic:nvPicPr>
                   <pic:blipFill>
-                    <a:blip xmlns:r="http://schemas.openxmlformats.org/officeDocument/2006/relationships" r:embed="R491409c67a0e400b"/>
+                    <a:blip xmlns:r="http://schemas.openxmlformats.org/officeDocument/2006/relationships" r:embed="R6eee5db63a154269"/>
                     <a:stretch>
                       <a:fillRect/>
                     </a:stretch>
@@ -3044,7 +3044,7 @@
                     <pic:cNvPicPr/>
                   </pic:nvPicPr>
                   <pic:blipFill>
-                    <a:blip xmlns:r="http://schemas.openxmlformats.org/officeDocument/2006/relationships" r:embed="Rc48987f18de341a7"/>
+                    <a:blip xmlns:r="http://schemas.openxmlformats.org/officeDocument/2006/relationships" r:embed="Rf56abe1629054839"/>
                     <a:stretch>
                       <a:fillRect/>
                     </a:stretch>
@@ -3095,7 +3095,7 @@
                     <pic:cNvPicPr/>
                   </pic:nvPicPr>
                   <pic:blipFill>
-                    <a:blip xmlns:r="http://schemas.openxmlformats.org/officeDocument/2006/relationships" r:embed="Rdd533e489e694cec"/>
+                    <a:blip xmlns:r="http://schemas.openxmlformats.org/officeDocument/2006/relationships" r:embed="R6f75db17e5f64de6"/>
                     <a:stretch>
                       <a:fillRect/>
                     </a:stretch>
@@ -3146,7 +3146,7 @@
                     <pic:cNvPicPr/>
                   </pic:nvPicPr>
                   <pic:blipFill>
-                    <a:blip xmlns:r="http://schemas.openxmlformats.org/officeDocument/2006/relationships" r:embed="Re21ccd25176a4a6f"/>
+                    <a:blip xmlns:r="http://schemas.openxmlformats.org/officeDocument/2006/relationships" r:embed="Rdba3fdb8b80e4381"/>
                     <a:stretch>
                       <a:fillRect/>
                     </a:stretch>
@@ -3197,7 +3197,7 @@
                     <pic:cNvPicPr/>
                   </pic:nvPicPr>
                   <pic:blipFill>
-                    <a:blip xmlns:r="http://schemas.openxmlformats.org/officeDocument/2006/relationships" r:embed="R27c0cb831fcf4c65"/>
+                    <a:blip xmlns:r="http://schemas.openxmlformats.org/officeDocument/2006/relationships" r:embed="R4a9a6213375b4a47"/>
                     <a:stretch>
                       <a:fillRect/>
                     </a:stretch>
@@ -3276,7 +3276,7 @@
                     <pic:cNvPicPr/>
                   </pic:nvPicPr>
                   <pic:blipFill>
-                    <a:blip xmlns:r="http://schemas.openxmlformats.org/officeDocument/2006/relationships" r:embed="Rf2961b17eeee43e3"/>
+                    <a:blip xmlns:r="http://schemas.openxmlformats.org/officeDocument/2006/relationships" r:embed="R9b6fe1b3121f4297"/>
                     <a:stretch>
                       <a:fillRect/>
                     </a:stretch>
@@ -3336,7 +3336,7 @@
                     <pic:cNvPicPr/>
                   </pic:nvPicPr>
                   <pic:blipFill>
-                    <a:blip xmlns:r="http://schemas.openxmlformats.org/officeDocument/2006/relationships" r:embed="R0a3876102d2e4215"/>
+                    <a:blip xmlns:r="http://schemas.openxmlformats.org/officeDocument/2006/relationships" r:embed="Rc0edd574c0e34a78"/>
                     <a:stretch>
                       <a:fillRect/>
                     </a:stretch>
@@ -3379,7 +3379,7 @@
       <w:r>
         <w:t xml:space="preserve"> against </w:t>
       </w:r>
-      <w:hyperlink xmlns:r="http://schemas.openxmlformats.org/officeDocument/2006/relationships" w:history="true" r:id="R65035da8bf584d5c">
+      <w:hyperlink xmlns:r="http://schemas.openxmlformats.org/officeDocument/2006/relationships" w:history="true" r:id="Rece5ab24f9f64591">
         <w:r>
           <w:rPr>
             <w:rStyle w:val="Hyperlink"/>
@@ -3506,7 +3506,7 @@
                     <pic:cNvPicPr/>
                   </pic:nvPicPr>
                   <pic:blipFill>
-                    <a:blip xmlns:r="http://schemas.openxmlformats.org/officeDocument/2006/relationships" r:embed="R4b29907cbb5342d8"/>
+                    <a:blip xmlns:r="http://schemas.openxmlformats.org/officeDocument/2006/relationships" r:embed="Rc3e2d9b713a74616"/>
                     <a:stretch>
                       <a:fillRect/>
                     </a:stretch>
@@ -3566,7 +3566,7 @@
                     <pic:cNvPicPr/>
                   </pic:nvPicPr>
                   <pic:blipFill>
-                    <a:blip xmlns:r="http://schemas.openxmlformats.org/officeDocument/2006/relationships" r:embed="R4653ed47c7144589"/>
+                    <a:blip xmlns:r="http://schemas.openxmlformats.org/officeDocument/2006/relationships" r:embed="Rf4338ec57ced4be7"/>
                     <a:stretch>
                       <a:fillRect/>
                     </a:stretch>
@@ -3626,7 +3626,7 @@
                     <pic:cNvPicPr/>
                   </pic:nvPicPr>
                   <pic:blipFill>
-                    <a:blip xmlns:r="http://schemas.openxmlformats.org/officeDocument/2006/relationships" r:embed="Rc140b7aa1f5d487f"/>
+                    <a:blip xmlns:r="http://schemas.openxmlformats.org/officeDocument/2006/relationships" r:embed="R36acf541623e4dd7"/>
                     <a:stretch>
                       <a:fillRect/>
                     </a:stretch>
@@ -3677,7 +3677,7 @@
                     <pic:cNvPicPr/>
                   </pic:nvPicPr>
                   <pic:blipFill>
-                    <a:blip xmlns:r="http://schemas.openxmlformats.org/officeDocument/2006/relationships" r:embed="R17b7eddc82004df9"/>
+                    <a:blip xmlns:r="http://schemas.openxmlformats.org/officeDocument/2006/relationships" r:embed="Rc11c703314fc41c3"/>
                     <a:stretch>
                       <a:fillRect/>
                     </a:stretch>
@@ -3733,7 +3733,7 @@
       <w:r>
         <w:drawing>
           <wp:inline xmlns:wp="http://schemas.openxmlformats.org/drawingml/2006/wordprocessingDrawing" distT="0" distB="0" distL="0" distR="0">
-            <wp:extent cx="4447528" cy="6480000"/>
+            <wp:extent cx="4160590" cy="6480000"/>
             <wp:effectExtent l="0" t="0" r="0" b="0"/>
             <wp:docPr id="59" name="Mermaid diagram 59" descr="Mermaid diagram"/>
             <wp:cNvGraphicFramePr>
@@ -3747,15 +3747,15 @@
                     <pic:cNvPicPr/>
                   </pic:nvPicPr>
                   <pic:blipFill>
-                    <a:blip xmlns:r="http://schemas.openxmlformats.org/officeDocument/2006/relationships" r:embed="R963b2f90dbf64c9d"/>
-                    <a:stretch>
-                      <a:fillRect/>
-                    </a:stretch>
-                  </pic:blipFill>
-                  <pic:spPr>
-                    <a:xfrm>
-                      <a:off x="0" y="0"/>
-                      <a:ext cx="4447528" cy="6480000"/>
+                    <a:blip xmlns:r="http://schemas.openxmlformats.org/officeDocument/2006/relationships" r:embed="R57d3fba3c1474583"/>
+                    <a:stretch>
+                      <a:fillRect/>
+                    </a:stretch>
+                  </pic:blipFill>
+                  <pic:spPr>
+                    <a:xfrm>
+                      <a:off x="0" y="0"/>
+                      <a:ext cx="4160590" cy="6480000"/>
                     </a:xfrm>
                     <a:prstGeom prst="rect">
                       <a:avLst/>
@@ -3798,7 +3798,7 @@
                     <pic:cNvPicPr/>
                   </pic:nvPicPr>
                   <pic:blipFill>
-                    <a:blip xmlns:r="http://schemas.openxmlformats.org/officeDocument/2006/relationships" r:embed="R23b0f591770f42fb"/>
+                    <a:blip xmlns:r="http://schemas.openxmlformats.org/officeDocument/2006/relationships" r:embed="Rf664594dee7448f1"/>
                     <a:stretch>
                       <a:fillRect/>
                     </a:stretch>
@@ -3849,7 +3849,7 @@
                     <pic:cNvPicPr/>
                   </pic:nvPicPr>
                   <pic:blipFill>
-                    <a:blip xmlns:r="http://schemas.openxmlformats.org/officeDocument/2006/relationships" r:embed="Rceca2ff49d1d4362"/>
+                    <a:blip xmlns:r="http://schemas.openxmlformats.org/officeDocument/2006/relationships" r:embed="R14a1e473a1dc4f15"/>
                     <a:stretch>
                       <a:fillRect/>
                     </a:stretch>

</xml_diff>